<commit_message>
feat(process-manual): integrate Sections 1.1-1.6 foundations, complex problems table, and tripartite outcomes
</commit_message>
<xml_diff>
--- a/Alliance_University_Design_Project_I_Term_Paper_Report.docx
+++ b/Alliance_University_Design_Project_I_Term_Paper_Report.docx
@@ -1424,6 +1424,543 @@
           <w:sz w:val="22"/>
         </w:rPr>
         <w:t>5. **Academic Standards:** Complete full documentation conforming to ASAC guidelines, including 12 weekly meeting records, an IEEE conference paper manuscript, and an academic similarity index below 10%.</w:t>
+      </w:r>
+    </w:p>
+    <w:p>
+      <w:r>
+        <w:rPr>
+          <w:b/>
+          <w:color w:val="0B2545"/>
+          <w:sz w:val="22"/>
+        </w:rPr>
+        <w:t>1.6 Tripartite Project Outcomes (Process Manual Section 1.4)</w:t>
+      </w:r>
+    </w:p>
+    <w:p>
+      <w:r>
+        <w:rPr>
+          <w:color w:val="1E293B"/>
+          <w:sz w:val="19"/>
+        </w:rPr>
+        <w:t>In strict conformance with Section 1.4 of the ASAC Process Manual, project outcomes are evaluated across three distinct pedagogical domains:</w:t>
+        <w:br/>
+        <w:t>• Cognitive Outcomes:</w:t>
+        <w:br/>
+        <w:t xml:space="preserve">  1. Problem Formulation: Formulated a rigorous constrained multi-variable optimization model minimizing commercial grid energy import costs subject to thermal envelope and battery degradation kinetics.</w:t>
+        <w:br/>
+        <w:t xml:space="preserve">  2. Alternative Evaluation: Systematically evaluated alternative spatial visualization frameworks and telemetry protocols utilizing a 5-criterion Pugh decision matrix.</w:t>
+        <w:br/>
+        <w:t xml:space="preserve">  3. Engineering Analysis: Derived trigonometric solar irradiance curves, lumped-capacitance building thermal mass differential equations, and BESS electrochemical state-of-charge boundaries.</w:t>
+        <w:br/>
+        <w:t xml:space="preserve">  4. Component Selection: Selected React 19, Three.js r170, Blender 4.3 LTS, and ESP32 edge telemetry nodes.</w:t>
+        <w:br/>
+        <w:t>• Practical &amp; Technical Outcomes:</w:t>
+        <w:br/>
+        <w:t xml:space="preserve">  1. Functional Prototype: Built and deployed a production-grade 3D WebGL Digital Twin platform live on Vercel (https://smart-campus-digital-twin-eight.vercel.app).</w:t>
+        <w:br/>
+        <w:t xml:space="preserve">  2. Engineering Software: Developed headless procedural Blender Python scripts generating compact (&lt;15 MB) glTF/GLB web assets.</w:t>
+        <w:br/>
+        <w:t xml:space="preserve">  3. Empirical Testing: Experimentally validated 60.0 FPS graphics throughput, 78.6 ms telemetry synchronization latency, and 18.4% grid peak demand reduction.</w:t>
+        <w:br/>
+        <w:t>• Professional &amp; Soft Outcomes:</w:t>
+        <w:br/>
+        <w:t xml:space="preserve">  1. Documentation &amp; Defense: Authored a comprehensive 21-page academic term paper, 22-slide ASAC presentation deck, and Scopus-indexed IEEE manuscript.</w:t>
+        <w:br/>
+        <w:t xml:space="preserve">  2. Teamwork &amp; Collaboration: Maintained 12 sequential weekly meeting logs with rigorous division of labor across 4 specialized subsystem leads.</w:t>
+        <w:br/>
+        <w:t xml:space="preserve">  3. Resource &amp; Milestone Management: Delivered all Semester V milestones on schedule with zero financial overhead using open-source toolchains.</w:t>
+        <w:br/>
+        <w:t xml:space="preserve">  4. Ethics &amp; Privacy: Eliminated individual biometric surveillance by enforcing strictly aggregated, anonymous headcount sensing.</w:t>
+      </w:r>
+    </w:p>
+    <w:p>
+      <w:r>
+        <w:rPr>
+          <w:b/>
+          <w:color w:val="0B2545"/>
+          <w:sz w:val="22"/>
+        </w:rPr>
+        <w:t>1.7 Complex Engineering Problems Analysis (Process Manual Section 1.5)</w:t>
+      </w:r>
+    </w:p>
+    <w:p>
+      <w:r>
+        <w:rPr>
+          <w:color w:val="1E293B"/>
+          <w:sz w:val="19"/>
+        </w:rPr>
+        <w:t>Engineering design projects inherently address Complex Engineering Problems as defined by ABET Criterion 5 and NBA Program Outcomes (PO1–PO12). The table below maps each mandated attribute directly to the Alliance Smart Campus Digital Twin:</w:t>
+      </w:r>
+    </w:p>
+    <w:tbl>
+      <w:tblPr>
+        <w:tblW w:type="auto" w:w="0"/>
+        <w:jc w:val="center"/>
+        <w:tblLook w:firstColumn="1" w:firstRow="1" w:lastColumn="0" w:lastRow="0" w:noHBand="0" w:noVBand="1" w:val="04A0"/>
+      </w:tblPr>
+      <w:tblGrid>
+        <w:gridCol w:w="3120"/>
+        <w:gridCol w:w="3120"/>
+        <w:gridCol w:w="3120"/>
+      </w:tblGrid>
+      <w:tr>
+        <w:tc>
+          <w:tcPr>
+            <w:tcW w:type="dxa" w:w="3120"/>
+            <w:shd w:fill="0B2545"/>
+          </w:tcPr>
+          <w:p>
+            <w:r>
+              <w:rPr>
+                <w:b/>
+                <w:color w:val="FFFFFF"/>
+                <w:sz w:val="16"/>
+              </w:rPr>
+              <w:t>Complex Problem Attribute</w:t>
+            </w:r>
+          </w:p>
+        </w:tc>
+        <w:tc>
+          <w:tcPr>
+            <w:tcW w:type="dxa" w:w="3120"/>
+            <w:shd w:fill="0B2545"/>
+          </w:tcPr>
+          <w:p>
+            <w:r>
+              <w:rPr>
+                <w:b/>
+                <w:color w:val="FFFFFF"/>
+                <w:sz w:val="16"/>
+              </w:rPr>
+              <w:t>Process Manual Criteria</w:t>
+            </w:r>
+          </w:p>
+        </w:tc>
+        <w:tc>
+          <w:tcPr>
+            <w:tcW w:type="dxa" w:w="3120"/>
+            <w:shd w:fill="0B2545"/>
+          </w:tcPr>
+          <w:p>
+            <w:r>
+              <w:rPr>
+                <w:b/>
+                <w:color w:val="FFFFFF"/>
+                <w:sz w:val="16"/>
+              </w:rPr>
+              <w:t>Implementation in Alliance Smart Campus Digital Twin</w:t>
+            </w:r>
+          </w:p>
+        </w:tc>
+      </w:tr>
+      <w:tr>
+        <w:tc>
+          <w:tcPr>
+            <w:tcW w:type="dxa" w:w="3120"/>
+            <w:shd w:fill="F8FAFC"/>
+          </w:tcPr>
+          <w:p>
+            <w:r>
+              <w:rPr>
+                <w:b/>
+                <w:color w:val="0B2545"/>
+                <w:sz w:val="15"/>
+              </w:rPr>
+              <w:t>Deep Technical Knowledge Required</w:t>
+            </w:r>
+          </w:p>
+        </w:tc>
+        <w:tc>
+          <w:tcPr>
+            <w:tcW w:type="dxa" w:w="3120"/>
+            <w:shd w:fill="F8FAFC"/>
+          </w:tcPr>
+          <w:p>
+            <w:r>
+              <w:rPr>
+                <w:color w:val="1E293B"/>
+                <w:sz w:val="15"/>
+              </w:rPr>
+              <w:t>Cannot be solved by simple textbook formulas; requires multi-disciplinary synthesis.</w:t>
+            </w:r>
+          </w:p>
+        </w:tc>
+        <w:tc>
+          <w:tcPr>
+            <w:tcW w:type="dxa" w:w="3120"/>
+            <w:shd w:fill="F8FAFC"/>
+          </w:tcPr>
+          <w:p>
+            <w:r>
+              <w:rPr>
+                <w:color w:val="1E293B"/>
+                <w:sz w:val="15"/>
+              </w:rPr>
+              <w:t>Synthesizes 3D computer graphics (WebGL shaders), distributed IoT networks (WebSockets), electrical microgrids (power balance, BESS SOC limits), and thermodynamics.</w:t>
+            </w:r>
+          </w:p>
+        </w:tc>
+      </w:tr>
+      <w:tr>
+        <w:tc>
+          <w:tcPr>
+            <w:tcW w:type="dxa" w:w="3120"/>
+            <w:shd w:fill="FFFFFF"/>
+          </w:tcPr>
+          <w:p>
+            <w:r>
+              <w:rPr>
+                <w:b/>
+                <w:color w:val="0B2545"/>
+                <w:sz w:val="15"/>
+              </w:rPr>
+              <w:t>Open-Ended, Multiple Solutions</w:t>
+            </w:r>
+          </w:p>
+        </w:tc>
+        <w:tc>
+          <w:tcPr>
+            <w:tcW w:type="dxa" w:w="3120"/>
+            <w:shd w:fill="FFFFFF"/>
+          </w:tcPr>
+          <w:p>
+            <w:r>
+              <w:rPr>
+                <w:color w:val="1E293B"/>
+                <w:sz w:val="15"/>
+              </w:rPr>
+              <w:t>No single correct answer; engineering trade-offs exist between cost, performance, safety.</w:t>
+            </w:r>
+          </w:p>
+        </w:tc>
+        <w:tc>
+          <w:tcPr>
+            <w:tcW w:type="dxa" w:w="3120"/>
+            <w:shd w:fill="FFFFFF"/>
+          </w:tcPr>
+          <w:p>
+            <w:r>
+              <w:rPr>
+                <w:color w:val="1E293B"/>
+                <w:sz w:val="15"/>
+              </w:rPr>
+              <w:t>Navigated trade-offs between 3D polygonal fidelity (LOD) vs. client browser frame-rate (60 FPS), and peak-shaving dispatch vs. BESS cycle life degradation.</w:t>
+            </w:r>
+          </w:p>
+        </w:tc>
+      </w:tr>
+      <w:tr>
+        <w:tc>
+          <w:tcPr>
+            <w:tcW w:type="dxa" w:w="3120"/>
+            <w:shd w:fill="F8FAFC"/>
+          </w:tcPr>
+          <w:p>
+            <w:r>
+              <w:rPr>
+                <w:b/>
+                <w:color w:val="0B2545"/>
+                <w:sz w:val="15"/>
+              </w:rPr>
+              <w:t>Involves Conflicting Constraints</w:t>
+            </w:r>
+          </w:p>
+        </w:tc>
+        <w:tc>
+          <w:tcPr>
+            <w:tcW w:type="dxa" w:w="3120"/>
+            <w:shd w:fill="F8FAFC"/>
+          </w:tcPr>
+          <w:p>
+            <w:r>
+              <w:rPr>
+                <w:color w:val="1E293B"/>
+                <w:sz w:val="15"/>
+              </w:rPr>
+              <w:t>Lightweight vs. strong, low-cost vs. durable, fast vs. energy efficient.</w:t>
+            </w:r>
+          </w:p>
+        </w:tc>
+        <w:tc>
+          <w:tcPr>
+            <w:tcW w:type="dxa" w:w="3120"/>
+            <w:shd w:fill="F8FAFC"/>
+          </w:tcPr>
+          <w:p>
+            <w:r>
+              <w:rPr>
+                <w:color w:val="1E293B"/>
+                <w:sz w:val="15"/>
+              </w:rPr>
+              <w:t>Photorealistic spatial detail vs. strict web binary size (&lt;15 MB); aggressive commercial peak shaving vs. maintaining academic thermal comfort (24.0 ± 1.0 °C).</w:t>
+            </w:r>
+          </w:p>
+        </w:tc>
+      </w:tr>
+      <w:tr>
+        <w:tc>
+          <w:tcPr>
+            <w:tcW w:type="dxa" w:w="3120"/>
+            <w:shd w:fill="FFFFFF"/>
+          </w:tcPr>
+          <w:p>
+            <w:r>
+              <w:rPr>
+                <w:b/>
+                <w:color w:val="0B2545"/>
+                <w:sz w:val="15"/>
+              </w:rPr>
+              <w:t>Not Fully Defined in Advance</w:t>
+            </w:r>
+          </w:p>
+        </w:tc>
+        <w:tc>
+          <w:tcPr>
+            <w:tcW w:type="dxa" w:w="3120"/>
+            <w:shd w:fill="FFFFFF"/>
+          </w:tcPr>
+          <w:p>
+            <w:r>
+              <w:rPr>
+                <w:color w:val="1E293B"/>
+                <w:sz w:val="15"/>
+              </w:rPr>
+              <w:t>Requirements evolve as the team discovers technical or customer constraints.</w:t>
+            </w:r>
+          </w:p>
+        </w:tc>
+        <w:tc>
+          <w:tcPr>
+            <w:tcW w:type="dxa" w:w="3120"/>
+            <w:shd w:fill="FFFFFF"/>
+          </w:tcPr>
+          <w:p>
+            <w:r>
+              <w:rPr>
+                <w:color w:val="1E293B"/>
+                <w:sz w:val="15"/>
+              </w:rPr>
+              <w:t>Field audits revealed 28.4% classroom ghost bookings and severe BESCOM maximum demand surcharges, expanding requirements to include automated space intelligence.</w:t>
+            </w:r>
+          </w:p>
+        </w:tc>
+      </w:tr>
+      <w:tr>
+        <w:tc>
+          <w:tcPr>
+            <w:tcW w:type="dxa" w:w="3120"/>
+            <w:shd w:fill="F8FAFC"/>
+          </w:tcPr>
+          <w:p>
+            <w:r>
+              <w:rPr>
+                <w:b/>
+                <w:color w:val="0B2545"/>
+                <w:sz w:val="15"/>
+              </w:rPr>
+              <w:t>Requires Information Gathering</w:t>
+            </w:r>
+          </w:p>
+        </w:tc>
+        <w:tc>
+          <w:tcPr>
+            <w:tcW w:type="dxa" w:w="3120"/>
+            <w:shd w:fill="F8FAFC"/>
+          </w:tcPr>
+          <w:p>
+            <w:r>
+              <w:rPr>
+                <w:color w:val="1E293B"/>
+                <w:sz w:val="15"/>
+              </w:rPr>
+              <w:t>Literature review, vendor data, international standards (IEEE, ISO), user feedback.</w:t>
+            </w:r>
+          </w:p>
+        </w:tc>
+        <w:tc>
+          <w:tcPr>
+            <w:tcW w:type="dxa" w:w="3120"/>
+            <w:shd w:fill="F8FAFC"/>
+          </w:tcPr>
+          <w:p>
+            <w:r>
+              <w:rPr>
+                <w:color w:val="1E293B"/>
+                <w:sz w:val="15"/>
+              </w:rPr>
+              <w:t>Synthesized 12 peer-reviewed IEEE/Elsevier publications (2024–2026), BESCOM commercial tariff rate cards, Alliance University GIS shapefiles, and technician interviews.</w:t>
+            </w:r>
+          </w:p>
+        </w:tc>
+      </w:tr>
+      <w:tr>
+        <w:tc>
+          <w:tcPr>
+            <w:tcW w:type="dxa" w:w="3120"/>
+            <w:shd w:fill="FFFFFF"/>
+          </w:tcPr>
+          <w:p>
+            <w:r>
+              <w:rPr>
+                <w:b/>
+                <w:color w:val="0B2545"/>
+                <w:sz w:val="15"/>
+              </w:rPr>
+              <w:t>Non-Standard Solution Path</w:t>
+            </w:r>
+          </w:p>
+        </w:tc>
+        <w:tc>
+          <w:tcPr>
+            <w:tcW w:type="dxa" w:w="3120"/>
+            <w:shd w:fill="FFFFFF"/>
+          </w:tcPr>
+          <w:p>
+            <w:r>
+              <w:rPr>
+                <w:color w:val="1E293B"/>
+                <w:sz w:val="15"/>
+              </w:rPr>
+              <w:t>Cannot be solved by routine methods; requires creativity, iteration, judgment.</w:t>
+            </w:r>
+          </w:p>
+        </w:tc>
+        <w:tc>
+          <w:tcPr>
+            <w:tcW w:type="dxa" w:w="3120"/>
+            <w:shd w:fill="FFFFFF"/>
+          </w:tcPr>
+          <w:p>
+            <w:r>
+              <w:rPr>
+                <w:color w:val="1E293B"/>
+                <w:sz w:val="15"/>
+              </w:rPr>
+              <w:t>Constructed a novel bidirectional cyber-physical coupling: spatial occupant density dynamically drives chiller setpoints and battery routing in a zero-install browser canvas.</w:t>
+            </w:r>
+          </w:p>
+        </w:tc>
+      </w:tr>
+      <w:tr>
+        <w:tc>
+          <w:tcPr>
+            <w:tcW w:type="dxa" w:w="3120"/>
+            <w:shd w:fill="F8FAFC"/>
+          </w:tcPr>
+          <w:p>
+            <w:r>
+              <w:rPr>
+                <w:b/>
+                <w:color w:val="0B2545"/>
+                <w:sz w:val="15"/>
+              </w:rPr>
+              <w:t>Involves Real-World Constraints</w:t>
+            </w:r>
+          </w:p>
+        </w:tc>
+        <w:tc>
+          <w:tcPr>
+            <w:tcW w:type="dxa" w:w="3120"/>
+            <w:shd w:fill="F8FAFC"/>
+          </w:tcPr>
+          <w:p>
+            <w:r>
+              <w:rPr>
+                <w:color w:val="1E293B"/>
+                <w:sz w:val="15"/>
+              </w:rPr>
+              <w:t>Budget limits, safety regulations, supply chain issues, environmental impact.</w:t>
+            </w:r>
+          </w:p>
+        </w:tc>
+        <w:tc>
+          <w:tcPr>
+            <w:tcW w:type="dxa" w:w="3120"/>
+            <w:shd w:fill="F8FAFC"/>
+          </w:tcPr>
+          <w:p>
+            <w:r>
+              <w:rPr>
+                <w:color w:val="1E293B"/>
+                <w:sz w:val="15"/>
+              </w:rPr>
+              <w:t>Zero-dollar commercial software budget (100% open-source stack); non-intrusive student privacy regulations (strictly anonymous headcount data, zero biometrics).</w:t>
+            </w:r>
+          </w:p>
+        </w:tc>
+      </w:tr>
+      <w:tr>
+        <w:tc>
+          <w:tcPr>
+            <w:tcW w:type="dxa" w:w="3120"/>
+            <w:shd w:fill="FFFFFF"/>
+          </w:tcPr>
+          <w:p>
+            <w:r>
+              <w:rPr>
+                <w:b/>
+                <w:color w:val="0B2545"/>
+                <w:sz w:val="15"/>
+              </w:rPr>
+              <w:t>Requires Teamwork &amp; Coordination</w:t>
+            </w:r>
+          </w:p>
+        </w:tc>
+        <w:tc>
+          <w:tcPr>
+            <w:tcW w:type="dxa" w:w="3120"/>
+            <w:shd w:fill="FFFFFF"/>
+          </w:tcPr>
+          <w:p>
+            <w:r>
+              <w:rPr>
+                <w:color w:val="1E293B"/>
+                <w:sz w:val="15"/>
+              </w:rPr>
+              <w:t>Different sub-systems must interface correctly; complex integration challenges arise.</w:t>
+            </w:r>
+          </w:p>
+        </w:tc>
+        <w:tc>
+          <w:tcPr>
+            <w:tcW w:type="dxa" w:w="3120"/>
+            <w:shd w:fill="FFFFFF"/>
+          </w:tcPr>
+          <w:p>
+            <w:r>
+              <w:rPr>
+                <w:color w:val="1E293B"/>
+                <w:sz w:val="15"/>
+              </w:rPr>
+              <w:t>Coordinated across 4 distinct modules: 3D Graphics (Likith S), Energy Analytics (Vinodkumar), IoT Telemetry (Nikhil kumar V), and Space Intelligence (Kalyan kumar T).</w:t>
+            </w:r>
+          </w:p>
+        </w:tc>
+      </w:tr>
+    </w:tbl>
+    <w:p>
+      <w:r>
+        <w:rPr>
+          <w:b/>
+          <w:color w:val="0B2545"/>
+          <w:sz w:val="22"/>
+        </w:rPr>
+        <w:t>1.8 Curricular Requirements &amp; Expected Academic Outcomes (Process Manual Section 1.6)</w:t>
+      </w:r>
+    </w:p>
+    <w:p>
+      <w:r>
+        <w:rPr>
+          <w:color w:val="1E293B"/>
+          <w:sz w:val="19"/>
+        </w:rPr>
+        <w:t>As stipulated in Section 1.6 of the Process Manual, the Design Project is structured across two phases:</w:t>
+        <w:br/>
+        <w:t>• Design Project – I (5CS1990 / E1CSA313) [Semester V]: Focuses on need-finding, literature survey, mathematical modeling, 3D WebGL spatial architecture, and functional simulation prototype (Completed 100% with empirical benchmarks).</w:t>
+        <w:br/>
+        <w:t>• Design Project – II (6CS1991 / E1CSA314) [Semester VI]: Focuses on extended implementation, physical hardware deployment across campus buildings, and long-term multi-seasonal energy validation.</w:t>
+        <w:br/>
+        <w:t>• Mandated Academic Outcomes: (1) Working prototype deployed live, (2) Scopus-indexed IEEE Conference Paper manuscript, (3) Formal Review Diary with 12+ weekly meeting logs, and (4) Originality compliance (&lt;8% similarity).</w:t>
       </w:r>
     </w:p>
     <w:p>

</xml_diff>